<commit_message>
docs: make client manual conversation-first
</commit_message>
<xml_diff>
--- a/Print Studio OpenDesign 客户使用手册.docx
+++ b/Print Studio OpenDesign 客户使用手册.docx
@@ -354,15 +354,1431 @@
         <w:pStyle w:val="Heading1"/>
       </w:pPr>
       <w:r>
-        <w:t>2. 使用前准备</w:t>
+        <w:t>2. 最简单的使用方式：拖图片 + 说人话</w:t>
       </w:r>
     </w:p>
     <w:p>
       <w:pPr>
+        <w:spacing w:after="120" w:line="283" w:lineRule="auto"/>
+      </w:pPr>
+      <w:r>
+        <w:rPr>
+          <w:rFonts w:ascii="Microsoft YaHei" w:hAnsi="Microsoft YaHei" w:eastAsia="Microsoft YaHei"/>
+          <w:color w:val="302920"/>
+          <w:sz w:val="21"/>
+        </w:rPr>
+        <w:t>你不需要先学命令，也不需要编辑 JSON。</w:t>
+      </w:r>
+    </w:p>
+    <w:p>
+      <w:pPr>
+        <w:spacing w:after="120" w:line="283" w:lineRule="auto"/>
+      </w:pPr>
+      <w:r>
+        <w:rPr>
+          <w:rFonts w:ascii="Microsoft YaHei" w:hAnsi="Microsoft YaHei" w:eastAsia="Microsoft YaHei"/>
+          <w:color w:val="302920"/>
+          <w:sz w:val="21"/>
+        </w:rPr>
+        <w:t>最推荐的真实使用方式是：</w:t>
+      </w:r>
+    </w:p>
+    <w:tbl>
+      <w:tblPr>
+        <w:tblW w:type="auto" w:w="0"/>
+        <w:jc w:val="center"/>
+        <w:tblLayout w:type="fixed"/>
+        <w:tblLook w:firstColumn="1" w:firstRow="1" w:lastColumn="0" w:lastRow="0" w:noHBand="0" w:noVBand="1" w:val="04A0"/>
+        <w:tblBorders>
+          <w:top w:val="single" w:sz="4" w:space="0" w:color="E6DED5"/>
+          <w:left w:val="single" w:sz="4" w:space="0" w:color="E6DED5"/>
+          <w:bottom w:val="single" w:sz="4" w:space="0" w:color="E6DED5"/>
+          <w:right w:val="single" w:sz="4" w:space="0" w:color="E6DED5"/>
+          <w:insideH w:val="single" w:sz="4" w:space="0" w:color="E6DED5"/>
+          <w:insideV w:val="single" w:sz="4" w:space="0" w:color="E6DED5"/>
+        </w:tblBorders>
+      </w:tblPr>
+      <w:tblGrid>
+        <w:gridCol w:w="9072"/>
+      </w:tblGrid>
+      <w:tr>
+        <w:tc>
+          <w:tcPr>
+            <w:tcW w:type="dxa" w:w="9936"/>
+            <w:shd w:fill="FBF7F2"/>
+            <w:tcMar>
+              <w:top w:w="120" w:type="dxa"/>
+              <w:start w:w="160" w:type="dxa"/>
+              <w:bottom w:w="120" w:type="dxa"/>
+              <w:end w:w="160" w:type="dxa"/>
+            </w:tcMar>
+          </w:tcPr>
+          <w:p>
+            <w:pPr>
+              <w:spacing w:after="0"/>
+            </w:pPr>
+            <w:r>
+              <w:rPr>
+                <w:rFonts w:ascii="Consolas" w:hAnsi="Consolas" w:eastAsia="Consolas"/>
+                <w:color w:val="3C342D"/>
+                <w:sz w:val="18"/>
+              </w:rPr>
+              <w:t>第 1 步：把图片文件夹拖进 Codex，或者把图片文件夹路径发给 Codex。</w:t>
+            </w:r>
+            <w:r>
+              <w:br/>
+            </w:r>
+            <w:r>
+              <w:rPr>
+                <w:rFonts w:ascii="Consolas" w:hAnsi="Consolas" w:eastAsia="Consolas"/>
+                <w:color w:val="3C342D"/>
+                <w:sz w:val="18"/>
+              </w:rPr>
+              <w:t>第 2 步：用人类语言说你想做什么。</w:t>
+            </w:r>
+            <w:r>
+              <w:br/>
+            </w:r>
+            <w:r>
+              <w:rPr>
+                <w:rFonts w:ascii="Consolas" w:hAnsi="Consolas" w:eastAsia="Consolas"/>
+                <w:color w:val="3C342D"/>
+                <w:sz w:val="18"/>
+              </w:rPr>
+              <w:t>第 3 步：Codex 会自动加载 Print Studio OpenDesign Skill。</w:t>
+            </w:r>
+            <w:r>
+              <w:br/>
+            </w:r>
+            <w:r>
+              <w:rPr>
+                <w:rFonts w:ascii="Consolas" w:hAnsi="Consolas" w:eastAsia="Consolas"/>
+                <w:color w:val="3C342D"/>
+                <w:sz w:val="18"/>
+              </w:rPr>
+              <w:t>第 4 步：Codex 会帮你分析图片、推荐规格、生成预览和交付包。</w:t>
+            </w:r>
+          </w:p>
+        </w:tc>
+      </w:tr>
+    </w:tbl>
+    <w:p>
+      <w:pPr>
+        <w:spacing w:after="40"/>
+      </w:pPr>
+    </w:p>
+    <w:p>
+      <w:pPr>
+        <w:spacing w:after="120" w:line="283" w:lineRule="auto"/>
+      </w:pPr>
+      <w:r>
+        <w:rPr>
+          <w:rFonts w:ascii="Microsoft YaHei" w:hAnsi="Microsoft YaHei" w:eastAsia="Microsoft YaHei"/>
+          <w:color w:val="302920"/>
+          <w:sz w:val="21"/>
+        </w:rPr>
+        <w:t>你可以直接这样说：</w:t>
+      </w:r>
+    </w:p>
+    <w:tbl>
+      <w:tblPr>
+        <w:tblW w:type="auto" w:w="0"/>
+        <w:jc w:val="center"/>
+        <w:tblLayout w:type="fixed"/>
+        <w:tblLook w:firstColumn="1" w:firstRow="1" w:lastColumn="0" w:lastRow="0" w:noHBand="0" w:noVBand="1" w:val="04A0"/>
+        <w:tblBorders>
+          <w:top w:val="single" w:sz="4" w:space="0" w:color="E6DED5"/>
+          <w:left w:val="single" w:sz="4" w:space="0" w:color="E6DED5"/>
+          <w:bottom w:val="single" w:sz="4" w:space="0" w:color="E6DED5"/>
+          <w:right w:val="single" w:sz="4" w:space="0" w:color="E6DED5"/>
+          <w:insideH w:val="single" w:sz="4" w:space="0" w:color="E6DED5"/>
+          <w:insideV w:val="single" w:sz="4" w:space="0" w:color="E6DED5"/>
+        </w:tblBorders>
+      </w:tblPr>
+      <w:tblGrid>
+        <w:gridCol w:w="9072"/>
+      </w:tblGrid>
+      <w:tr>
+        <w:tc>
+          <w:tcPr>
+            <w:tcW w:type="dxa" w:w="9936"/>
+            <w:shd w:fill="FBF7F2"/>
+            <w:tcMar>
+              <w:top w:w="120" w:type="dxa"/>
+              <w:start w:w="160" w:type="dxa"/>
+              <w:bottom w:w="120" w:type="dxa"/>
+              <w:end w:w="160" w:type="dxa"/>
+            </w:tcMar>
+          </w:tcPr>
+          <w:p>
+            <w:pPr>
+              <w:spacing w:after="0"/>
+            </w:pPr>
+            <w:r>
+              <w:rPr>
+                <w:rFonts w:ascii="Consolas" w:hAnsi="Consolas" w:eastAsia="Consolas"/>
+                <w:color w:val="3C342D"/>
+                <w:sz w:val="18"/>
+              </w:rPr>
+              <w:t>使用 Print Studio OpenDesign。</w:t>
+            </w:r>
+            <w:r>
+              <w:br/>
+            </w:r>
+            <w:r>
+              <w:rPr>
+                <w:rFonts w:ascii="Consolas" w:hAnsi="Consolas" w:eastAsia="Consolas"/>
+                <w:color w:val="3C342D"/>
+                <w:sz w:val="18"/>
+              </w:rPr>
+              <w:t>这些是我的图片，我想做一套 12 张月历卡。</w:t>
+            </w:r>
+            <w:r>
+              <w:br/>
+            </w:r>
+            <w:r>
+              <w:rPr>
+                <w:rFonts w:ascii="Consolas" w:hAnsi="Consolas" w:eastAsia="Consolas"/>
+                <w:color w:val="3C342D"/>
+                <w:sz w:val="18"/>
+              </w:rPr>
+              <w:t>请先帮我分析图片适合什么尺寸、材质和版式，</w:t>
+            </w:r>
+            <w:r>
+              <w:br/>
+            </w:r>
+            <w:r>
+              <w:rPr>
+                <w:rFonts w:ascii="Consolas" w:hAnsi="Consolas" w:eastAsia="Consolas"/>
+                <w:color w:val="3C342D"/>
+                <w:sz w:val="18"/>
+              </w:rPr>
+              <w:t>再生成材质预览和 A/B/C 版式候选。</w:t>
+            </w:r>
+          </w:p>
+        </w:tc>
+      </w:tr>
+    </w:tbl>
+    <w:p>
+      <w:pPr>
+        <w:spacing w:after="40"/>
+      </w:pPr>
+    </w:p>
+    <w:p>
+      <w:pPr>
+        <w:spacing w:after="120" w:line="283" w:lineRule="auto"/>
+      </w:pPr>
+      <w:r>
+        <w:rPr>
+          <w:rFonts w:ascii="Microsoft YaHei" w:hAnsi="Microsoft YaHei" w:eastAsia="Microsoft YaHei"/>
+          <w:color w:val="302920"/>
+          <w:sz w:val="21"/>
+        </w:rPr>
+        <w:t>如果你已经知道要做什么，可以这样说：</w:t>
+      </w:r>
+    </w:p>
+    <w:tbl>
+      <w:tblPr>
+        <w:tblW w:type="auto" w:w="0"/>
+        <w:jc w:val="center"/>
+        <w:tblLayout w:type="fixed"/>
+        <w:tblLook w:firstColumn="1" w:firstRow="1" w:lastColumn="0" w:lastRow="0" w:noHBand="0" w:noVBand="1" w:val="04A0"/>
+        <w:tblBorders>
+          <w:top w:val="single" w:sz="4" w:space="0" w:color="E6DED5"/>
+          <w:left w:val="single" w:sz="4" w:space="0" w:color="E6DED5"/>
+          <w:bottom w:val="single" w:sz="4" w:space="0" w:color="E6DED5"/>
+          <w:right w:val="single" w:sz="4" w:space="0" w:color="E6DED5"/>
+          <w:insideH w:val="single" w:sz="4" w:space="0" w:color="E6DED5"/>
+          <w:insideV w:val="single" w:sz="4" w:space="0" w:color="E6DED5"/>
+        </w:tblBorders>
+      </w:tblPr>
+      <w:tblGrid>
+        <w:gridCol w:w="9072"/>
+      </w:tblGrid>
+      <w:tr>
+        <w:tc>
+          <w:tcPr>
+            <w:tcW w:type="dxa" w:w="9936"/>
+            <w:shd w:fill="FBF7F2"/>
+            <w:tcMar>
+              <w:top w:w="120" w:type="dxa"/>
+              <w:start w:w="160" w:type="dxa"/>
+              <w:bottom w:w="120" w:type="dxa"/>
+              <w:end w:w="160" w:type="dxa"/>
+            </w:tcMar>
+          </w:tcPr>
+          <w:p>
+            <w:pPr>
+              <w:spacing w:after="0"/>
+            </w:pPr>
+            <w:r>
+              <w:rPr>
+                <w:rFonts w:ascii="Consolas" w:hAnsi="Consolas" w:eastAsia="Consolas"/>
+                <w:color w:val="3C342D"/>
+                <w:sz w:val="18"/>
+              </w:rPr>
+              <w:t>使用 Print Studio OpenDesign。</w:t>
+            </w:r>
+            <w:r>
+              <w:br/>
+            </w:r>
+            <w:r>
+              <w:rPr>
+                <w:rFonts w:ascii="Consolas" w:hAnsi="Consolas" w:eastAsia="Consolas"/>
+                <w:color w:val="3C342D"/>
+                <w:sz w:val="18"/>
+              </w:rPr>
+              <w:t>我要用这组图片做 5×7 英寸贺卡，300g 超白白卡纸，单面，圆角。</w:t>
+            </w:r>
+            <w:r>
+              <w:br/>
+            </w:r>
+            <w:r>
+              <w:rPr>
+                <w:rFonts w:ascii="Consolas" w:hAnsi="Consolas" w:eastAsia="Consolas"/>
+                <w:color w:val="3C342D"/>
+                <w:sz w:val="18"/>
+              </w:rPr>
+              <w:t>请直接生成材质预览、版式候选、白底图、氛围图、4K 下载图和印刷文件。</w:t>
+            </w:r>
+          </w:p>
+        </w:tc>
+      </w:tr>
+    </w:tbl>
+    <w:p>
+      <w:pPr>
+        <w:spacing w:after="40"/>
+      </w:pPr>
+    </w:p>
+    <w:p>
+      <w:pPr>
+        <w:spacing w:after="120" w:line="283" w:lineRule="auto"/>
+      </w:pPr>
+      <w:r>
+        <w:rPr>
+          <w:rFonts w:ascii="Microsoft YaHei" w:hAnsi="Microsoft YaHei" w:eastAsia="Microsoft YaHei"/>
+          <w:color w:val="302920"/>
+          <w:sz w:val="21"/>
+        </w:rPr>
+        <w:t>如果你什么都还没想好，也可以只说：</w:t>
+      </w:r>
+    </w:p>
+    <w:tbl>
+      <w:tblPr>
+        <w:tblW w:type="auto" w:w="0"/>
+        <w:jc w:val="center"/>
+        <w:tblLayout w:type="fixed"/>
+        <w:tblLook w:firstColumn="1" w:firstRow="1" w:lastColumn="0" w:lastRow="0" w:noHBand="0" w:noVBand="1" w:val="04A0"/>
+        <w:tblBorders>
+          <w:top w:val="single" w:sz="4" w:space="0" w:color="E6DED5"/>
+          <w:left w:val="single" w:sz="4" w:space="0" w:color="E6DED5"/>
+          <w:bottom w:val="single" w:sz="4" w:space="0" w:color="E6DED5"/>
+          <w:right w:val="single" w:sz="4" w:space="0" w:color="E6DED5"/>
+          <w:insideH w:val="single" w:sz="4" w:space="0" w:color="E6DED5"/>
+          <w:insideV w:val="single" w:sz="4" w:space="0" w:color="E6DED5"/>
+        </w:tblBorders>
+      </w:tblPr>
+      <w:tblGrid>
+        <w:gridCol w:w="9072"/>
+      </w:tblGrid>
+      <w:tr>
+        <w:tc>
+          <w:tcPr>
+            <w:tcW w:type="dxa" w:w="9936"/>
+            <w:shd w:fill="FBF7F2"/>
+            <w:tcMar>
+              <w:top w:w="120" w:type="dxa"/>
+              <w:start w:w="160" w:type="dxa"/>
+              <w:bottom w:w="120" w:type="dxa"/>
+              <w:end w:w="160" w:type="dxa"/>
+            </w:tcMar>
+          </w:tcPr>
+          <w:p>
+            <w:pPr>
+              <w:spacing w:after="0"/>
+            </w:pPr>
+            <w:r>
+              <w:rPr>
+                <w:rFonts w:ascii="Consolas" w:hAnsi="Consolas" w:eastAsia="Consolas"/>
+                <w:color w:val="3C342D"/>
+                <w:sz w:val="18"/>
+              </w:rPr>
+              <w:t>使用 Print Studio OpenDesign。</w:t>
+            </w:r>
+            <w:r>
+              <w:br/>
+            </w:r>
+            <w:r>
+              <w:rPr>
+                <w:rFonts w:ascii="Consolas" w:hAnsi="Consolas" w:eastAsia="Consolas"/>
+                <w:color w:val="3C342D"/>
+                <w:sz w:val="18"/>
+              </w:rPr>
+              <w:t>我还没想好做什么，你先根据这些图片帮我推荐。</w:t>
+            </w:r>
+          </w:p>
+        </w:tc>
+      </w:tr>
+    </w:tbl>
+    <w:p>
+      <w:pPr>
+        <w:spacing w:after="40"/>
+      </w:pPr>
+    </w:p>
+    <w:p>
+      <w:pPr>
+        <w:spacing w:after="120" w:line="283" w:lineRule="auto"/>
+      </w:pPr>
+      <w:r>
+        <w:rPr>
+          <w:rFonts w:ascii="Microsoft YaHei" w:hAnsi="Microsoft YaHei" w:eastAsia="Microsoft YaHei"/>
+          <w:color w:val="302920"/>
+          <w:sz w:val="21"/>
+        </w:rPr>
+        <w:t>Codex 接下来会用 Skill 自动完成：</w:t>
+      </w:r>
+    </w:p>
+    <w:p>
+      <w:pPr>
+        <w:pStyle w:val="ListBullet"/>
+        <w:spacing w:after="60"/>
+      </w:pPr>
+      <w:r>
+        <w:rPr>
+          <w:rFonts w:ascii="Microsoft YaHei" w:hAnsi="Microsoft YaHei" w:eastAsia="Microsoft YaHei"/>
+          <w:color w:val="302920"/>
+          <w:sz w:val="20"/>
+        </w:rPr>
+        <w:t>看图并理解图片风格。</w:t>
+      </w:r>
+    </w:p>
+    <w:p>
+      <w:pPr>
+        <w:pStyle w:val="ListBullet"/>
+        <w:spacing w:after="60"/>
+      </w:pPr>
+      <w:r>
+        <w:rPr>
+          <w:rFonts w:ascii="Microsoft YaHei" w:hAnsi="Microsoft YaHei" w:eastAsia="Microsoft YaHei"/>
+          <w:color w:val="302920"/>
+          <w:sz w:val="20"/>
+        </w:rPr>
+        <w:t>推荐产品类型，例如月历卡、贺卡、明信片、书签、吊牌、挂历。</w:t>
+      </w:r>
+    </w:p>
+    <w:p>
+      <w:pPr>
+        <w:pStyle w:val="ListBullet"/>
+        <w:spacing w:after="60"/>
+      </w:pPr>
+      <w:r>
+        <w:rPr>
+          <w:rFonts w:ascii="Microsoft YaHei" w:hAnsi="Microsoft YaHei" w:eastAsia="Microsoft YaHei"/>
+          <w:color w:val="302920"/>
+          <w:sz w:val="20"/>
+        </w:rPr>
+        <w:t>推荐尺寸、材质、张数和版式。</w:t>
+      </w:r>
+    </w:p>
+    <w:p>
+      <w:pPr>
+        <w:pStyle w:val="ListBullet"/>
+        <w:spacing w:after="60"/>
+      </w:pPr>
+      <w:r>
+        <w:rPr>
+          <w:rFonts w:ascii="Microsoft YaHei" w:hAnsi="Microsoft YaHei" w:eastAsia="Microsoft YaHei"/>
+          <w:color w:val="302920"/>
+          <w:sz w:val="20"/>
+        </w:rPr>
+        <w:t>生成材质预览和 A/B/C 版式候选。</w:t>
+      </w:r>
+    </w:p>
+    <w:p>
+      <w:pPr>
+        <w:pStyle w:val="ListBullet"/>
+        <w:spacing w:after="60"/>
+      </w:pPr>
+      <w:r>
+        <w:rPr>
+          <w:rFonts w:ascii="Microsoft YaHei" w:hAnsi="Microsoft YaHei" w:eastAsia="Microsoft YaHei"/>
+          <w:color w:val="302920"/>
+          <w:sz w:val="20"/>
+        </w:rPr>
+        <w:t>你选中一版后，Codex 锁版并批量输出。</w:t>
+      </w:r>
+    </w:p>
+    <w:p>
+      <w:pPr>
+        <w:pStyle w:val="ListBullet"/>
+        <w:spacing w:after="60"/>
+      </w:pPr>
+      <w:r>
+        <w:rPr>
+          <w:rFonts w:ascii="Microsoft YaHei" w:hAnsi="Microsoft YaHei" w:eastAsia="Microsoft YaHei"/>
+          <w:color w:val="302920"/>
+          <w:sz w:val="20"/>
+        </w:rPr>
+        <w:t>最后生成交付首页和压缩包。</w:t>
+      </w:r>
+    </w:p>
+    <w:tbl>
+      <w:tblPr>
+        <w:tblW w:type="auto" w:w="0"/>
+        <w:jc w:val="center"/>
+        <w:tblLayout w:type="fixed"/>
+        <w:tblLook w:firstColumn="1" w:firstRow="1" w:lastColumn="0" w:lastRow="0" w:noHBand="0" w:noVBand="1" w:val="04A0"/>
+        <w:tblBorders>
+          <w:top w:val="single" w:sz="4" w:space="0" w:color="E4D5C4"/>
+          <w:left w:val="single" w:sz="4" w:space="0" w:color="E4D5C4"/>
+          <w:bottom w:val="single" w:sz="4" w:space="0" w:color="E4D5C4"/>
+          <w:right w:val="single" w:sz="4" w:space="0" w:color="E4D5C4"/>
+          <w:insideH w:val="single" w:sz="4" w:space="0" w:color="E4D5C4"/>
+          <w:insideV w:val="single" w:sz="4" w:space="0" w:color="E4D5C4"/>
+        </w:tblBorders>
+      </w:tblPr>
+      <w:tblGrid>
+        <w:gridCol w:w="9072"/>
+      </w:tblGrid>
+      <w:tr>
+        <w:tc>
+          <w:tcPr>
+            <w:tcW w:type="dxa" w:w="9072"/>
+            <w:shd w:fill="F7F1E8"/>
+            <w:tcMar>
+              <w:top w:w="140" w:type="dxa"/>
+              <w:start w:w="180" w:type="dxa"/>
+              <w:bottom w:w="140" w:type="dxa"/>
+              <w:end w:w="180" w:type="dxa"/>
+            </w:tcMar>
+          </w:tcPr>
+          <w:p>
+            <w:pPr>
+              <w:spacing w:after="0"/>
+            </w:pPr>
+            <w:r>
+              <w:rPr>
+                <w:rFonts w:ascii="Microsoft YaHei" w:hAnsi="Microsoft YaHei" w:eastAsia="Microsoft YaHei"/>
+                <w:b/>
+                <w:color w:val="B56B50"/>
+                <w:sz w:val="21"/>
+              </w:rPr>
+              <w:t>重要：</w:t>
+            </w:r>
+            <w:r>
+              <w:rPr>
+                <w:rFonts w:ascii="Microsoft YaHei" w:hAnsi="Microsoft YaHei" w:eastAsia="Microsoft YaHei"/>
+                <w:color w:val="302920"/>
+                <w:sz w:val="21"/>
+              </w:rPr>
+              <w:t>你只需要用自然语言告诉 Codex 想做什么；具体调用哪个脚本、怎么生成文件，由 Codex 和 Skill 完成。</w:t>
+            </w:r>
+          </w:p>
+        </w:tc>
+      </w:tr>
+    </w:tbl>
+    <w:p>
+      <w:pPr>
+        <w:spacing w:after="40"/>
+      </w:pPr>
+    </w:p>
+    <w:p>
+      <w:pPr>
+        <w:pStyle w:val="Heading1"/>
+      </w:pPr>
+      <w:r>
+        <w:t>3. 客户常用说法模板</w:t>
+      </w:r>
+    </w:p>
+    <w:p>
+      <w:pPr>
         <w:pStyle w:val="Heading2"/>
       </w:pPr>
       <w:r>
-        <w:t>2.1 准备图片文件夹</w:t>
+        <w:t>3.1 不知道做什么，让 Codex 推荐</w:t>
+      </w:r>
+    </w:p>
+    <w:tbl>
+      <w:tblPr>
+        <w:tblW w:type="auto" w:w="0"/>
+        <w:jc w:val="center"/>
+        <w:tblLayout w:type="fixed"/>
+        <w:tblLook w:firstColumn="1" w:firstRow="1" w:lastColumn="0" w:lastRow="0" w:noHBand="0" w:noVBand="1" w:val="04A0"/>
+        <w:tblBorders>
+          <w:top w:val="single" w:sz="4" w:space="0" w:color="E6DED5"/>
+          <w:left w:val="single" w:sz="4" w:space="0" w:color="E6DED5"/>
+          <w:bottom w:val="single" w:sz="4" w:space="0" w:color="E6DED5"/>
+          <w:right w:val="single" w:sz="4" w:space="0" w:color="E6DED5"/>
+          <w:insideH w:val="single" w:sz="4" w:space="0" w:color="E6DED5"/>
+          <w:insideV w:val="single" w:sz="4" w:space="0" w:color="E6DED5"/>
+        </w:tblBorders>
+      </w:tblPr>
+      <w:tblGrid>
+        <w:gridCol w:w="9072"/>
+      </w:tblGrid>
+      <w:tr>
+        <w:tc>
+          <w:tcPr>
+            <w:tcW w:type="dxa" w:w="9936"/>
+            <w:shd w:fill="FBF7F2"/>
+            <w:tcMar>
+              <w:top w:w="120" w:type="dxa"/>
+              <w:start w:w="160" w:type="dxa"/>
+              <w:bottom w:w="120" w:type="dxa"/>
+              <w:end w:w="160" w:type="dxa"/>
+            </w:tcMar>
+          </w:tcPr>
+          <w:p>
+            <w:pPr>
+              <w:spacing w:after="0"/>
+            </w:pPr>
+            <w:r>
+              <w:rPr>
+                <w:rFonts w:ascii="Consolas" w:hAnsi="Consolas" w:eastAsia="Consolas"/>
+                <w:color w:val="3C342D"/>
+                <w:sz w:val="18"/>
+              </w:rPr>
+              <w:t>使用 Print Studio OpenDesign。</w:t>
+            </w:r>
+            <w:r>
+              <w:br/>
+            </w:r>
+            <w:r>
+              <w:rPr>
+                <w:rFonts w:ascii="Consolas" w:hAnsi="Consolas" w:eastAsia="Consolas"/>
+                <w:color w:val="3C342D"/>
+                <w:sz w:val="18"/>
+              </w:rPr>
+              <w:t>我给你一组图片，请先分析图片，告诉我适合做什么印刷品。</w:t>
+            </w:r>
+            <w:r>
+              <w:br/>
+            </w:r>
+            <w:r>
+              <w:rPr>
+                <w:rFonts w:ascii="Consolas" w:hAnsi="Consolas" w:eastAsia="Consolas"/>
+                <w:color w:val="3C342D"/>
+                <w:sz w:val="18"/>
+              </w:rPr>
+              <w:t>需要给出推荐理由，并生成材质预览和版式候选。</w:t>
+            </w:r>
+          </w:p>
+        </w:tc>
+      </w:tr>
+    </w:tbl>
+    <w:p>
+      <w:pPr>
+        <w:spacing w:after="40"/>
+      </w:pPr>
+    </w:p>
+    <w:p>
+      <w:pPr>
+        <w:pStyle w:val="Heading2"/>
+      </w:pPr>
+      <w:r>
+        <w:t>3.2 做 12 个月月历卡</w:t>
+      </w:r>
+    </w:p>
+    <w:tbl>
+      <w:tblPr>
+        <w:tblW w:type="auto" w:w="0"/>
+        <w:jc w:val="center"/>
+        <w:tblLayout w:type="fixed"/>
+        <w:tblLook w:firstColumn="1" w:firstRow="1" w:lastColumn="0" w:lastRow="0" w:noHBand="0" w:noVBand="1" w:val="04A0"/>
+        <w:tblBorders>
+          <w:top w:val="single" w:sz="4" w:space="0" w:color="E6DED5"/>
+          <w:left w:val="single" w:sz="4" w:space="0" w:color="E6DED5"/>
+          <w:bottom w:val="single" w:sz="4" w:space="0" w:color="E6DED5"/>
+          <w:right w:val="single" w:sz="4" w:space="0" w:color="E6DED5"/>
+          <w:insideH w:val="single" w:sz="4" w:space="0" w:color="E6DED5"/>
+          <w:insideV w:val="single" w:sz="4" w:space="0" w:color="E6DED5"/>
+        </w:tblBorders>
+      </w:tblPr>
+      <w:tblGrid>
+        <w:gridCol w:w="9072"/>
+      </w:tblGrid>
+      <w:tr>
+        <w:tc>
+          <w:tcPr>
+            <w:tcW w:type="dxa" w:w="9936"/>
+            <w:shd w:fill="FBF7F2"/>
+            <w:tcMar>
+              <w:top w:w="120" w:type="dxa"/>
+              <w:start w:w="160" w:type="dxa"/>
+              <w:bottom w:w="120" w:type="dxa"/>
+              <w:end w:w="160" w:type="dxa"/>
+            </w:tcMar>
+          </w:tcPr>
+          <w:p>
+            <w:pPr>
+              <w:spacing w:after="0"/>
+            </w:pPr>
+            <w:r>
+              <w:rPr>
+                <w:rFonts w:ascii="Consolas" w:hAnsi="Consolas" w:eastAsia="Consolas"/>
+                <w:color w:val="3C342D"/>
+                <w:sz w:val="18"/>
+              </w:rPr>
+              <w:t>使用 Print Studio OpenDesign。</w:t>
+            </w:r>
+            <w:r>
+              <w:br/>
+            </w:r>
+            <w:r>
+              <w:rPr>
+                <w:rFonts w:ascii="Consolas" w:hAnsi="Consolas" w:eastAsia="Consolas"/>
+                <w:color w:val="3C342D"/>
+                <w:sz w:val="18"/>
+              </w:rPr>
+              <w:t>我要用这组图片做一套 12 张月历卡，年份 2027。</w:t>
+            </w:r>
+            <w:r>
+              <w:br/>
+            </w:r>
+            <w:r>
+              <w:rPr>
+                <w:rFonts w:ascii="Consolas" w:hAnsi="Consolas" w:eastAsia="Consolas"/>
+                <w:color w:val="3C342D"/>
+                <w:sz w:val="18"/>
+              </w:rPr>
+              <w:t>请推荐材质和版式，并生成预览图、印刷文件、白底图、氛围图、系列总览图和 4K 下载图。</w:t>
+            </w:r>
+          </w:p>
+        </w:tc>
+      </w:tr>
+    </w:tbl>
+    <w:p>
+      <w:pPr>
+        <w:spacing w:after="40"/>
+      </w:pPr>
+    </w:p>
+    <w:p>
+      <w:pPr>
+        <w:pStyle w:val="Heading2"/>
+      </w:pPr>
+      <w:r>
+        <w:t>3.3 做贺卡</w:t>
+      </w:r>
+    </w:p>
+    <w:tbl>
+      <w:tblPr>
+        <w:tblW w:type="auto" w:w="0"/>
+        <w:jc w:val="center"/>
+        <w:tblLayout w:type="fixed"/>
+        <w:tblLook w:firstColumn="1" w:firstRow="1" w:lastColumn="0" w:lastRow="0" w:noHBand="0" w:noVBand="1" w:val="04A0"/>
+        <w:tblBorders>
+          <w:top w:val="single" w:sz="4" w:space="0" w:color="E6DED5"/>
+          <w:left w:val="single" w:sz="4" w:space="0" w:color="E6DED5"/>
+          <w:bottom w:val="single" w:sz="4" w:space="0" w:color="E6DED5"/>
+          <w:right w:val="single" w:sz="4" w:space="0" w:color="E6DED5"/>
+          <w:insideH w:val="single" w:sz="4" w:space="0" w:color="E6DED5"/>
+          <w:insideV w:val="single" w:sz="4" w:space="0" w:color="E6DED5"/>
+        </w:tblBorders>
+      </w:tblPr>
+      <w:tblGrid>
+        <w:gridCol w:w="9072"/>
+      </w:tblGrid>
+      <w:tr>
+        <w:tc>
+          <w:tcPr>
+            <w:tcW w:type="dxa" w:w="9936"/>
+            <w:shd w:fill="FBF7F2"/>
+            <w:tcMar>
+              <w:top w:w="120" w:type="dxa"/>
+              <w:start w:w="160" w:type="dxa"/>
+              <w:bottom w:w="120" w:type="dxa"/>
+              <w:end w:w="160" w:type="dxa"/>
+            </w:tcMar>
+          </w:tcPr>
+          <w:p>
+            <w:pPr>
+              <w:spacing w:after="0"/>
+            </w:pPr>
+            <w:r>
+              <w:rPr>
+                <w:rFonts w:ascii="Consolas" w:hAnsi="Consolas" w:eastAsia="Consolas"/>
+                <w:color w:val="3C342D"/>
+                <w:sz w:val="18"/>
+              </w:rPr>
+              <w:t>使用 Print Studio OpenDesign。</w:t>
+            </w:r>
+            <w:r>
+              <w:br/>
+            </w:r>
+            <w:r>
+              <w:rPr>
+                <w:rFonts w:ascii="Consolas" w:hAnsi="Consolas" w:eastAsia="Consolas"/>
+                <w:color w:val="3C342D"/>
+                <w:sz w:val="18"/>
+              </w:rPr>
+              <w:t>我要做 5×7 英寸贺卡，300g 超白白卡纸，单面，可以圆角。</w:t>
+            </w:r>
+            <w:r>
+              <w:br/>
+            </w:r>
+            <w:r>
+              <w:rPr>
+                <w:rFonts w:ascii="Consolas" w:hAnsi="Consolas" w:eastAsia="Consolas"/>
+                <w:color w:val="3C342D"/>
+                <w:sz w:val="18"/>
+              </w:rPr>
+              <w:t>请先生成 A/B/C 版式候选，我确认后再批量输出。</w:t>
+            </w:r>
+          </w:p>
+        </w:tc>
+      </w:tr>
+    </w:tbl>
+    <w:p>
+      <w:pPr>
+        <w:spacing w:after="40"/>
+      </w:pPr>
+    </w:p>
+    <w:p>
+      <w:pPr>
+        <w:pStyle w:val="Heading2"/>
+      </w:pPr>
+      <w:r>
+        <w:t>3.4 做明信片 / 书签 / 吊牌</w:t>
+      </w:r>
+    </w:p>
+    <w:tbl>
+      <w:tblPr>
+        <w:tblW w:type="auto" w:w="0"/>
+        <w:jc w:val="center"/>
+        <w:tblLayout w:type="fixed"/>
+        <w:tblLook w:firstColumn="1" w:firstRow="1" w:lastColumn="0" w:lastRow="0" w:noHBand="0" w:noVBand="1" w:val="04A0"/>
+        <w:tblBorders>
+          <w:top w:val="single" w:sz="4" w:space="0" w:color="E6DED5"/>
+          <w:left w:val="single" w:sz="4" w:space="0" w:color="E6DED5"/>
+          <w:bottom w:val="single" w:sz="4" w:space="0" w:color="E6DED5"/>
+          <w:right w:val="single" w:sz="4" w:space="0" w:color="E6DED5"/>
+          <w:insideH w:val="single" w:sz="4" w:space="0" w:color="E6DED5"/>
+          <w:insideV w:val="single" w:sz="4" w:space="0" w:color="E6DED5"/>
+        </w:tblBorders>
+      </w:tblPr>
+      <w:tblGrid>
+        <w:gridCol w:w="9072"/>
+      </w:tblGrid>
+      <w:tr>
+        <w:tc>
+          <w:tcPr>
+            <w:tcW w:type="dxa" w:w="9936"/>
+            <w:shd w:fill="FBF7F2"/>
+            <w:tcMar>
+              <w:top w:w="120" w:type="dxa"/>
+              <w:start w:w="160" w:type="dxa"/>
+              <w:bottom w:w="120" w:type="dxa"/>
+              <w:end w:w="160" w:type="dxa"/>
+            </w:tcMar>
+          </w:tcPr>
+          <w:p>
+            <w:pPr>
+              <w:spacing w:after="0"/>
+            </w:pPr>
+            <w:r>
+              <w:rPr>
+                <w:rFonts w:ascii="Consolas" w:hAnsi="Consolas" w:eastAsia="Consolas"/>
+                <w:color w:val="3C342D"/>
+                <w:sz w:val="18"/>
+              </w:rPr>
+              <w:t>使用 Print Studio OpenDesign。</w:t>
+            </w:r>
+            <w:r>
+              <w:br/>
+            </w:r>
+            <w:r>
+              <w:rPr>
+                <w:rFonts w:ascii="Consolas" w:hAnsi="Consolas" w:eastAsia="Consolas"/>
+                <w:color w:val="3C342D"/>
+                <w:sz w:val="18"/>
+              </w:rPr>
+              <w:t>请根据这组图片做一套明信片/书签/吊牌。</w:t>
+            </w:r>
+            <w:r>
+              <w:br/>
+            </w:r>
+            <w:r>
+              <w:rPr>
+                <w:rFonts w:ascii="Consolas" w:hAnsi="Consolas" w:eastAsia="Consolas"/>
+                <w:color w:val="3C342D"/>
+                <w:sz w:val="18"/>
+              </w:rPr>
+              <w:t>如果尺寸和材质不确定，请先推荐 2-3 个选择，并说明理由。</w:t>
+            </w:r>
+          </w:p>
+        </w:tc>
+      </w:tr>
+    </w:tbl>
+    <w:p>
+      <w:pPr>
+        <w:spacing w:after="40"/>
+      </w:pPr>
+    </w:p>
+    <w:p>
+      <w:pPr>
+        <w:pStyle w:val="Heading2"/>
+      </w:pPr>
+      <w:r>
+        <w:t>3.5 直接完整跑一遍</w:t>
+      </w:r>
+    </w:p>
+    <w:tbl>
+      <w:tblPr>
+        <w:tblW w:type="auto" w:w="0"/>
+        <w:jc w:val="center"/>
+        <w:tblLayout w:type="fixed"/>
+        <w:tblLook w:firstColumn="1" w:firstRow="1" w:lastColumn="0" w:lastRow="0" w:noHBand="0" w:noVBand="1" w:val="04A0"/>
+        <w:tblBorders>
+          <w:top w:val="single" w:sz="4" w:space="0" w:color="E6DED5"/>
+          <w:left w:val="single" w:sz="4" w:space="0" w:color="E6DED5"/>
+          <w:bottom w:val="single" w:sz="4" w:space="0" w:color="E6DED5"/>
+          <w:right w:val="single" w:sz="4" w:space="0" w:color="E6DED5"/>
+          <w:insideH w:val="single" w:sz="4" w:space="0" w:color="E6DED5"/>
+          <w:insideV w:val="single" w:sz="4" w:space="0" w:color="E6DED5"/>
+        </w:tblBorders>
+      </w:tblPr>
+      <w:tblGrid>
+        <w:gridCol w:w="9072"/>
+      </w:tblGrid>
+      <w:tr>
+        <w:tc>
+          <w:tcPr>
+            <w:tcW w:type="dxa" w:w="9936"/>
+            <w:shd w:fill="FBF7F2"/>
+            <w:tcMar>
+              <w:top w:w="120" w:type="dxa"/>
+              <w:start w:w="160" w:type="dxa"/>
+              <w:bottom w:w="120" w:type="dxa"/>
+              <w:end w:w="160" w:type="dxa"/>
+            </w:tcMar>
+          </w:tcPr>
+          <w:p>
+            <w:pPr>
+              <w:spacing w:after="0"/>
+            </w:pPr>
+            <w:r>
+              <w:rPr>
+                <w:rFonts w:ascii="Consolas" w:hAnsi="Consolas" w:eastAsia="Consolas"/>
+                <w:color w:val="3C342D"/>
+                <w:sz w:val="18"/>
+              </w:rPr>
+              <w:t>使用 Print Studio OpenDesign。</w:t>
+            </w:r>
+            <w:r>
+              <w:br/>
+            </w:r>
+            <w:r>
+              <w:rPr>
+                <w:rFonts w:ascii="Consolas" w:hAnsi="Consolas" w:eastAsia="Consolas"/>
+                <w:color w:val="3C342D"/>
+                <w:sz w:val="18"/>
+              </w:rPr>
+              <w:t>图片路径是：/你的图片文件夹路径</w:t>
+            </w:r>
+            <w:r>
+              <w:br/>
+            </w:r>
+            <w:r>
+              <w:rPr>
+                <w:rFonts w:ascii="Consolas" w:hAnsi="Consolas" w:eastAsia="Consolas"/>
+                <w:color w:val="3C342D"/>
+                <w:sz w:val="18"/>
+              </w:rPr>
+              <w:t>产品：月历卡</w:t>
+            </w:r>
+            <w:r>
+              <w:br/>
+            </w:r>
+            <w:r>
+              <w:rPr>
+                <w:rFonts w:ascii="Consolas" w:hAnsi="Consolas" w:eastAsia="Consolas"/>
+                <w:color w:val="3C342D"/>
+                <w:sz w:val="18"/>
+              </w:rPr>
+              <w:t>张数：12</w:t>
+            </w:r>
+            <w:r>
+              <w:br/>
+            </w:r>
+            <w:r>
+              <w:rPr>
+                <w:rFonts w:ascii="Consolas" w:hAnsi="Consolas" w:eastAsia="Consolas"/>
+                <w:color w:val="3C342D"/>
+                <w:sz w:val="18"/>
+              </w:rPr>
+              <w:t>材质：300g 超白白卡纸</w:t>
+            </w:r>
+            <w:r>
+              <w:br/>
+            </w:r>
+            <w:r>
+              <w:rPr>
+                <w:rFonts w:ascii="Consolas" w:hAnsi="Consolas" w:eastAsia="Consolas"/>
+                <w:color w:val="3C342D"/>
+                <w:sz w:val="18"/>
+              </w:rPr>
+              <w:t>版式：先默认选 B</w:t>
+            </w:r>
+            <w:r>
+              <w:br/>
+            </w:r>
+            <w:r>
+              <w:rPr>
+                <w:rFonts w:ascii="Consolas" w:hAnsi="Consolas" w:eastAsia="Consolas"/>
+                <w:color w:val="3C342D"/>
+                <w:sz w:val="18"/>
+              </w:rPr>
+              <w:t>请直接完整跑一遍，并告诉我交付首页在哪里。</w:t>
+            </w:r>
+          </w:p>
+        </w:tc>
+      </w:tr>
+    </w:tbl>
+    <w:p>
+      <w:pPr>
+        <w:spacing w:after="40"/>
+      </w:pPr>
+    </w:p>
+    <w:p>
+      <w:pPr>
+        <w:pStyle w:val="Heading1"/>
+      </w:pPr>
+      <w:r>
+        <w:t>4. 如果 Codex 需要你确认，它会问什么</w:t>
+      </w:r>
+    </w:p>
+    <w:p>
+      <w:pPr>
+        <w:spacing w:after="120" w:line="283" w:lineRule="auto"/>
+      </w:pPr>
+      <w:r>
+        <w:rPr>
+          <w:rFonts w:ascii="Microsoft YaHei" w:hAnsi="Microsoft YaHei" w:eastAsia="Microsoft YaHei"/>
+          <w:color w:val="302920"/>
+          <w:sz w:val="21"/>
+        </w:rPr>
+        <w:t>通常 Codex 只会问少量必要问题：</w:t>
+      </w:r>
+    </w:p>
+    <w:tbl>
+      <w:tblPr>
+        <w:tblW w:type="auto" w:w="0"/>
+        <w:jc w:val="center"/>
+        <w:tblLayout w:type="autofit"/>
+        <w:tblLook w:firstColumn="1" w:firstRow="1" w:lastColumn="0" w:lastRow="0" w:noHBand="0" w:noVBand="1" w:val="04A0"/>
+        <w:tblBorders>
+          <w:top w:val="single" w:sz="4" w:space="0" w:color="D8C9B8"/>
+          <w:left w:val="single" w:sz="4" w:space="0" w:color="D8C9B8"/>
+          <w:bottom w:val="single" w:sz="4" w:space="0" w:color="D8C9B8"/>
+          <w:right w:val="single" w:sz="4" w:space="0" w:color="D8C9B8"/>
+          <w:insideH w:val="single" w:sz="4" w:space="0" w:color="D8C9B8"/>
+          <w:insideV w:val="single" w:sz="4" w:space="0" w:color="D8C9B8"/>
+        </w:tblBorders>
+      </w:tblPr>
+      <w:tblGrid>
+        <w:gridCol w:w="4968"/>
+        <w:gridCol w:w="4968"/>
+      </w:tblGrid>
+      <w:tr>
+        <w:tc>
+          <w:tcPr>
+            <w:tcW w:type="dxa" w:w="4968"/>
+            <w:shd w:fill="EADCCB"/>
+            <w:tcMar>
+              <w:top w:w="100" w:type="dxa"/>
+              <w:start w:w="120" w:type="dxa"/>
+              <w:bottom w:w="100" w:type="dxa"/>
+              <w:end w:w="120" w:type="dxa"/>
+            </w:tcMar>
+            <w:vAlign w:val="center"/>
+          </w:tcPr>
+          <w:p>
+            <w:pPr>
+              <w:spacing w:after="0"/>
+            </w:pPr>
+            <w:r>
+              <w:rPr>
+                <w:rFonts w:ascii="Microsoft YaHei" w:hAnsi="Microsoft YaHei" w:eastAsia="Microsoft YaHei"/>
+                <w:b/>
+                <w:color w:val="302920"/>
+                <w:sz w:val="19"/>
+              </w:rPr>
+              <w:t>问题</w:t>
+            </w:r>
+          </w:p>
+        </w:tc>
+        <w:tc>
+          <w:tcPr>
+            <w:tcW w:type="dxa" w:w="4968"/>
+            <w:shd w:fill="EADCCB"/>
+            <w:tcMar>
+              <w:top w:w="100" w:type="dxa"/>
+              <w:start w:w="120" w:type="dxa"/>
+              <w:bottom w:w="100" w:type="dxa"/>
+              <w:end w:w="120" w:type="dxa"/>
+            </w:tcMar>
+            <w:vAlign w:val="center"/>
+          </w:tcPr>
+          <w:p>
+            <w:pPr>
+              <w:spacing w:after="0"/>
+            </w:pPr>
+            <w:r>
+              <w:rPr>
+                <w:rFonts w:ascii="Microsoft YaHei" w:hAnsi="Microsoft YaHei" w:eastAsia="Microsoft YaHei"/>
+                <w:b/>
+                <w:color w:val="302920"/>
+                <w:sz w:val="19"/>
+              </w:rPr>
+              <w:t>为什么要问</w:t>
+            </w:r>
+          </w:p>
+        </w:tc>
+      </w:tr>
+      <w:tr>
+        <w:tc>
+          <w:tcPr>
+            <w:tcW w:type="dxa" w:w="4968"/>
+            <w:tcMar>
+              <w:top w:w="100" w:type="dxa"/>
+              <w:start w:w="120" w:type="dxa"/>
+              <w:bottom w:w="100" w:type="dxa"/>
+              <w:end w:w="120" w:type="dxa"/>
+            </w:tcMar>
+            <w:vAlign w:val="center"/>
+          </w:tcPr>
+          <w:p>
+            <w:pPr>
+              <w:spacing w:after="0"/>
+            </w:pPr>
+            <w:r>
+              <w:rPr>
+                <w:rFonts w:ascii="Microsoft YaHei" w:hAnsi="Microsoft YaHei" w:eastAsia="Microsoft YaHei"/>
+                <w:color w:val="302920"/>
+                <w:sz w:val="19"/>
+              </w:rPr>
+              <w:t>做什么产品？</w:t>
+            </w:r>
+          </w:p>
+        </w:tc>
+        <w:tc>
+          <w:tcPr>
+            <w:tcW w:type="dxa" w:w="4968"/>
+            <w:tcMar>
+              <w:top w:w="100" w:type="dxa"/>
+              <w:start w:w="120" w:type="dxa"/>
+              <w:bottom w:w="100" w:type="dxa"/>
+              <w:end w:w="120" w:type="dxa"/>
+            </w:tcMar>
+            <w:vAlign w:val="center"/>
+          </w:tcPr>
+          <w:p>
+            <w:pPr>
+              <w:spacing w:after="0"/>
+            </w:pPr>
+            <w:r>
+              <w:rPr>
+                <w:rFonts w:ascii="Microsoft YaHei" w:hAnsi="Microsoft YaHei" w:eastAsia="Microsoft YaHei"/>
+                <w:color w:val="302920"/>
+                <w:sz w:val="19"/>
+              </w:rPr>
+              <w:t>决定尺寸、版式和输出结构</w:t>
+            </w:r>
+          </w:p>
+        </w:tc>
+      </w:tr>
+      <w:tr>
+        <w:tc>
+          <w:tcPr>
+            <w:tcW w:type="dxa" w:w="4968"/>
+            <w:tcMar>
+              <w:top w:w="100" w:type="dxa"/>
+              <w:start w:w="120" w:type="dxa"/>
+              <w:bottom w:w="100" w:type="dxa"/>
+              <w:end w:w="120" w:type="dxa"/>
+            </w:tcMar>
+            <w:vAlign w:val="center"/>
+          </w:tcPr>
+          <w:p>
+            <w:pPr>
+              <w:spacing w:after="0"/>
+            </w:pPr>
+            <w:r>
+              <w:rPr>
+                <w:rFonts w:ascii="Microsoft YaHei" w:hAnsi="Microsoft YaHei" w:eastAsia="Microsoft YaHei"/>
+                <w:color w:val="302920"/>
+                <w:sz w:val="19"/>
+              </w:rPr>
+              <w:t>做几张？</w:t>
+            </w:r>
+          </w:p>
+        </w:tc>
+        <w:tc>
+          <w:tcPr>
+            <w:tcW w:type="dxa" w:w="4968"/>
+            <w:tcMar>
+              <w:top w:w="100" w:type="dxa"/>
+              <w:start w:w="120" w:type="dxa"/>
+              <w:bottom w:w="100" w:type="dxa"/>
+              <w:end w:w="120" w:type="dxa"/>
+            </w:tcMar>
+            <w:vAlign w:val="center"/>
+          </w:tcPr>
+          <w:p>
+            <w:pPr>
+              <w:spacing w:after="0"/>
+            </w:pPr>
+            <w:r>
+              <w:rPr>
+                <w:rFonts w:ascii="Microsoft YaHei" w:hAnsi="Microsoft YaHei" w:eastAsia="Microsoft YaHei"/>
+                <w:color w:val="302920"/>
+                <w:sz w:val="19"/>
+              </w:rPr>
+              <w:t>决定单张、套装、12 个月或自定义 N 张</w:t>
+            </w:r>
+          </w:p>
+        </w:tc>
+      </w:tr>
+      <w:tr>
+        <w:tc>
+          <w:tcPr>
+            <w:tcW w:type="dxa" w:w="4968"/>
+            <w:tcMar>
+              <w:top w:w="100" w:type="dxa"/>
+              <w:start w:w="120" w:type="dxa"/>
+              <w:bottom w:w="100" w:type="dxa"/>
+              <w:end w:w="120" w:type="dxa"/>
+            </w:tcMar>
+            <w:vAlign w:val="center"/>
+          </w:tcPr>
+          <w:p>
+            <w:pPr>
+              <w:spacing w:after="0"/>
+            </w:pPr>
+            <w:r>
+              <w:rPr>
+                <w:rFonts w:ascii="Microsoft YaHei" w:hAnsi="Microsoft YaHei" w:eastAsia="Microsoft YaHei"/>
+                <w:color w:val="302920"/>
+                <w:sz w:val="19"/>
+              </w:rPr>
+              <w:t>用什么材质？</w:t>
+            </w:r>
+          </w:p>
+        </w:tc>
+        <w:tc>
+          <w:tcPr>
+            <w:tcW w:type="dxa" w:w="4968"/>
+            <w:tcMar>
+              <w:top w:w="100" w:type="dxa"/>
+              <w:start w:w="120" w:type="dxa"/>
+              <w:bottom w:w="100" w:type="dxa"/>
+              <w:end w:w="120" w:type="dxa"/>
+            </w:tcMar>
+            <w:vAlign w:val="center"/>
+          </w:tcPr>
+          <w:p>
+            <w:pPr>
+              <w:spacing w:after="0"/>
+            </w:pPr>
+            <w:r>
+              <w:rPr>
+                <w:rFonts w:ascii="Microsoft YaHei" w:hAnsi="Microsoft YaHei" w:eastAsia="Microsoft YaHei"/>
+                <w:color w:val="302920"/>
+                <w:sz w:val="19"/>
+              </w:rPr>
+              <w:t>决定颜色补偿、纹理模拟和印刷风险</w:t>
+            </w:r>
+          </w:p>
+        </w:tc>
+      </w:tr>
+      <w:tr>
+        <w:tc>
+          <w:tcPr>
+            <w:tcW w:type="dxa" w:w="4968"/>
+            <w:tcMar>
+              <w:top w:w="100" w:type="dxa"/>
+              <w:start w:w="120" w:type="dxa"/>
+              <w:bottom w:w="100" w:type="dxa"/>
+              <w:end w:w="120" w:type="dxa"/>
+            </w:tcMar>
+            <w:vAlign w:val="center"/>
+          </w:tcPr>
+          <w:p>
+            <w:pPr>
+              <w:spacing w:after="0"/>
+            </w:pPr>
+            <w:r>
+              <w:rPr>
+                <w:rFonts w:ascii="Microsoft YaHei" w:hAnsi="Microsoft YaHei" w:eastAsia="Microsoft YaHei"/>
+                <w:color w:val="302920"/>
+                <w:sz w:val="19"/>
+              </w:rPr>
+              <w:t>选 A/B/C 哪个版式？</w:t>
+            </w:r>
+          </w:p>
+        </w:tc>
+        <w:tc>
+          <w:tcPr>
+            <w:tcW w:type="dxa" w:w="4968"/>
+            <w:tcMar>
+              <w:top w:w="100" w:type="dxa"/>
+              <w:start w:w="120" w:type="dxa"/>
+              <w:bottom w:w="100" w:type="dxa"/>
+              <w:end w:w="120" w:type="dxa"/>
+            </w:tcMar>
+            <w:vAlign w:val="center"/>
+          </w:tcPr>
+          <w:p>
+            <w:pPr>
+              <w:spacing w:after="0"/>
+            </w:pPr>
+            <w:r>
+              <w:rPr>
+                <w:rFonts w:ascii="Microsoft YaHei" w:hAnsi="Microsoft YaHei" w:eastAsia="Microsoft YaHei"/>
+                <w:color w:val="302920"/>
+                <w:sz w:val="19"/>
+              </w:rPr>
+              <w:t>锁定后才能稳定批量输出</w:t>
+            </w:r>
+          </w:p>
+        </w:tc>
+      </w:tr>
+      <w:tr>
+        <w:tc>
+          <w:tcPr>
+            <w:tcW w:type="dxa" w:w="4968"/>
+            <w:tcMar>
+              <w:top w:w="100" w:type="dxa"/>
+              <w:start w:w="120" w:type="dxa"/>
+              <w:bottom w:w="100" w:type="dxa"/>
+              <w:end w:w="120" w:type="dxa"/>
+            </w:tcMar>
+            <w:vAlign w:val="center"/>
+          </w:tcPr>
+          <w:p>
+            <w:pPr>
+              <w:spacing w:after="0"/>
+            </w:pPr>
+            <w:r>
+              <w:rPr>
+                <w:rFonts w:ascii="Microsoft YaHei" w:hAnsi="Microsoft YaHei" w:eastAsia="Microsoft YaHei"/>
+                <w:color w:val="302920"/>
+                <w:sz w:val="19"/>
+              </w:rPr>
+              <w:t>是否要印刷文件？</w:t>
+            </w:r>
+          </w:p>
+        </w:tc>
+        <w:tc>
+          <w:tcPr>
+            <w:tcW w:type="dxa" w:w="4968"/>
+            <w:tcMar>
+              <w:top w:w="100" w:type="dxa"/>
+              <w:start w:w="120" w:type="dxa"/>
+              <w:bottom w:w="100" w:type="dxa"/>
+              <w:end w:w="120" w:type="dxa"/>
+            </w:tcMar>
+            <w:vAlign w:val="center"/>
+          </w:tcPr>
+          <w:p>
+            <w:pPr>
+              <w:spacing w:after="0"/>
+            </w:pPr>
+            <w:r>
+              <w:rPr>
+                <w:rFonts w:ascii="Microsoft YaHei" w:hAnsi="Microsoft YaHei" w:eastAsia="Microsoft YaHei"/>
+                <w:color w:val="302920"/>
+                <w:sz w:val="19"/>
+              </w:rPr>
+              <w:t>如果只做展示图，可以少跑一些输出</w:t>
+            </w:r>
+          </w:p>
+        </w:tc>
+      </w:tr>
+    </w:tbl>
+    <w:p>
+      <w:pPr>
+        <w:spacing w:after="80"/>
+      </w:pPr>
+    </w:p>
+    <w:p>
+      <w:pPr>
+        <w:spacing w:after="120" w:line="283" w:lineRule="auto"/>
+      </w:pPr>
+      <w:r>
+        <w:rPr>
+          <w:rFonts w:ascii="Microsoft YaHei" w:hAnsi="Microsoft YaHei" w:eastAsia="Microsoft YaHei"/>
+          <w:color w:val="302920"/>
+          <w:sz w:val="21"/>
+        </w:rPr>
+        <w:t>如果你不确定，可以直接回答：</w:t>
+      </w:r>
+    </w:p>
+    <w:tbl>
+      <w:tblPr>
+        <w:tblW w:type="auto" w:w="0"/>
+        <w:jc w:val="center"/>
+        <w:tblLayout w:type="fixed"/>
+        <w:tblLook w:firstColumn="1" w:firstRow="1" w:lastColumn="0" w:lastRow="0" w:noHBand="0" w:noVBand="1" w:val="04A0"/>
+        <w:tblBorders>
+          <w:top w:val="single" w:sz="4" w:space="0" w:color="E6DED5"/>
+          <w:left w:val="single" w:sz="4" w:space="0" w:color="E6DED5"/>
+          <w:bottom w:val="single" w:sz="4" w:space="0" w:color="E6DED5"/>
+          <w:right w:val="single" w:sz="4" w:space="0" w:color="E6DED5"/>
+          <w:insideH w:val="single" w:sz="4" w:space="0" w:color="E6DED5"/>
+          <w:insideV w:val="single" w:sz="4" w:space="0" w:color="E6DED5"/>
+        </w:tblBorders>
+      </w:tblPr>
+      <w:tblGrid>
+        <w:gridCol w:w="9072"/>
+      </w:tblGrid>
+      <w:tr>
+        <w:tc>
+          <w:tcPr>
+            <w:tcW w:type="dxa" w:w="9936"/>
+            <w:shd w:fill="FBF7F2"/>
+            <w:tcMar>
+              <w:top w:w="120" w:type="dxa"/>
+              <w:start w:w="160" w:type="dxa"/>
+              <w:bottom w:w="120" w:type="dxa"/>
+              <w:end w:w="160" w:type="dxa"/>
+            </w:tcMar>
+          </w:tcPr>
+          <w:p>
+            <w:pPr>
+              <w:spacing w:after="0"/>
+            </w:pPr>
+            <w:r>
+              <w:rPr>
+                <w:rFonts w:ascii="Consolas" w:hAnsi="Consolas" w:eastAsia="Consolas"/>
+                <w:color w:val="3C342D"/>
+                <w:sz w:val="18"/>
+              </w:rPr>
+              <w:t>你先推荐一个默认方案，并说明理由。</w:t>
+            </w:r>
+          </w:p>
+        </w:tc>
+      </w:tr>
+    </w:tbl>
+    <w:p>
+      <w:pPr>
+        <w:spacing w:after="40"/>
+      </w:pPr>
+    </w:p>
+    <w:p>
+      <w:pPr>
+        <w:pStyle w:val="Heading1"/>
+      </w:pPr>
+      <w:r>
+        <w:t>5. 使用前准备</w:t>
+      </w:r>
+    </w:p>
+    <w:p>
+      <w:pPr>
+        <w:pStyle w:val="Heading2"/>
+      </w:pPr>
+      <w:r>
+        <w:t>5.1 准备图片文件夹</w:t>
       </w:r>
     </w:p>
     <w:p>
@@ -561,7 +1977,7 @@
         <w:pStyle w:val="Heading2"/>
       </w:pPr>
       <w:r>
-        <w:t>2.2 打开运行目录</w:t>
+        <w:t>5.2 如果需要手动运行，再打开运行目录</w:t>
       </w:r>
     </w:p>
     <w:p>
@@ -697,7 +2113,7 @@
         <w:pStyle w:val="Heading1"/>
       </w:pPr>
       <w:r>
-        <w:t>3. 最推荐的使用方式：一键引导流程</w:t>
+        <w:t>6. 如果需要手动运行：一键引导流程</w:t>
       </w:r>
     </w:p>
     <w:p>
@@ -1018,7 +2434,7 @@
         <w:pStyle w:val="Heading2"/>
       </w:pPr>
       <w:r>
-        <w:t>3.1 如果已经知道参数，可以一条命令跑完</w:t>
+        <w:t>6.1 如果已经知道参数，可以一条命令跑完</w:t>
       </w:r>
     </w:p>
     <w:p>
@@ -2180,7 +3596,7 @@
         <w:pStyle w:val="Heading1"/>
       </w:pPr>
       <w:r>
-        <w:t>4. 每一步会得到什么</w:t>
+        <w:t>7. 每一步会得到什么</w:t>
       </w:r>
     </w:p>
     <w:p>
@@ -3225,7 +4641,7 @@
         <w:pStyle w:val="Heading1"/>
       </w:pPr>
       <w:r>
-        <w:t>5. 输出文件怎么理解</w:t>
+        <w:t>8. 输出文件怎么理解</w:t>
       </w:r>
     </w:p>
     <w:p>
@@ -3429,7 +4845,7 @@
         <w:pStyle w:val="Heading2"/>
       </w:pPr>
       <w:r>
-        <w:t>5.1 `screen/`</w:t>
+        <w:t>8.1 `screen/`</w:t>
       </w:r>
     </w:p>
     <w:p>
@@ -3450,7 +4866,7 @@
         <w:pStyle w:val="Heading2"/>
       </w:pPr>
       <w:r>
-        <w:t>5.2 `print/`</w:t>
+        <w:t>8.2 `print/`</w:t>
       </w:r>
     </w:p>
     <w:p>
@@ -3484,7 +4900,7 @@
         <w:pStyle w:val="Heading2"/>
       </w:pPr>
       <w:r>
-        <w:t>5.3 `commerce/`</w:t>
+        <w:t>8.3 `commerce/`</w:t>
       </w:r>
     </w:p>
     <w:p>
@@ -3560,7 +4976,7 @@
         <w:pStyle w:val="Heading2"/>
       </w:pPr>
       <w:r>
-        <w:t>5.4 `download_4k/`</w:t>
+        <w:t>8.4 `download_4k/`</w:t>
       </w:r>
     </w:p>
     <w:p>
@@ -3581,7 +4997,7 @@
         <w:pStyle w:val="Heading2"/>
       </w:pPr>
       <w:r>
-        <w:t>5.5 `reports/`</w:t>
+        <w:t>8.5 `reports/`</w:t>
       </w:r>
     </w:p>
     <w:p>
@@ -3658,7 +5074,7 @@
         <w:pStyle w:val="Heading1"/>
       </w:pPr>
       <w:r>
-        <w:t>6. 如何判断能不能交付</w:t>
+        <w:t>9. 如何判断能不能交付</w:t>
       </w:r>
     </w:p>
     <w:p>
@@ -4140,7 +5556,7 @@
         <w:pStyle w:val="Heading1"/>
       </w:pPr>
       <w:r>
-        <w:t>7. 推荐给终端客户看的文件</w:t>
+        <w:t>10. 推荐给终端客户看的文件</w:t>
       </w:r>
     </w:p>
     <w:p>
@@ -4428,7 +5844,7 @@
         <w:pStyle w:val="Heading1"/>
       </w:pPr>
       <w:r>
-        <w:t>8. 常见问题</w:t>
+        <w:t>11. 常见问题</w:t>
       </w:r>
     </w:p>
     <w:p>
@@ -4688,7 +6104,7 @@
         <w:pStyle w:val="Heading1"/>
       </w:pPr>
       <w:r>
-        <w:t>9. 最简单的交付演示话术</w:t>
+        <w:t>12. 最简单的交付演示话术</w:t>
       </w:r>
     </w:p>
     <w:p>
@@ -4769,7 +6185,7 @@
         <w:pStyle w:val="Heading1"/>
       </w:pPr>
       <w:r>
-        <w:t>10. 一句话开始使用</w:t>
+        <w:t>13. 一句话开始使用</w:t>
       </w:r>
     </w:p>
     <w:p>
@@ -4782,7 +6198,82 @@
           <w:color w:val="302920"/>
           <w:sz w:val="21"/>
         </w:rPr>
-        <w:t>在运行目录执行：</w:t>
+        <w:t>在 Codex 里直接说：</w:t>
+      </w:r>
+    </w:p>
+    <w:tbl>
+      <w:tblPr>
+        <w:tblW w:type="auto" w:w="0"/>
+        <w:jc w:val="center"/>
+        <w:tblLayout w:type="fixed"/>
+        <w:tblLook w:firstColumn="1" w:firstRow="1" w:lastColumn="0" w:lastRow="0" w:noHBand="0" w:noVBand="1" w:val="04A0"/>
+        <w:tblBorders>
+          <w:top w:val="single" w:sz="4" w:space="0" w:color="E6DED5"/>
+          <w:left w:val="single" w:sz="4" w:space="0" w:color="E6DED5"/>
+          <w:bottom w:val="single" w:sz="4" w:space="0" w:color="E6DED5"/>
+          <w:right w:val="single" w:sz="4" w:space="0" w:color="E6DED5"/>
+          <w:insideH w:val="single" w:sz="4" w:space="0" w:color="E6DED5"/>
+          <w:insideV w:val="single" w:sz="4" w:space="0" w:color="E6DED5"/>
+        </w:tblBorders>
+      </w:tblPr>
+      <w:tblGrid>
+        <w:gridCol w:w="9072"/>
+      </w:tblGrid>
+      <w:tr>
+        <w:tc>
+          <w:tcPr>
+            <w:tcW w:type="dxa" w:w="9936"/>
+            <w:shd w:fill="FBF7F2"/>
+            <w:tcMar>
+              <w:top w:w="120" w:type="dxa"/>
+              <w:start w:w="160" w:type="dxa"/>
+              <w:bottom w:w="120" w:type="dxa"/>
+              <w:end w:w="160" w:type="dxa"/>
+            </w:tcMar>
+          </w:tcPr>
+          <w:p>
+            <w:pPr>
+              <w:spacing w:after="0"/>
+            </w:pPr>
+            <w:r>
+              <w:rPr>
+                <w:rFonts w:ascii="Consolas" w:hAnsi="Consolas" w:eastAsia="Consolas"/>
+                <w:color w:val="3C342D"/>
+                <w:sz w:val="18"/>
+              </w:rPr>
+              <w:t>使用 Print Studio OpenDesign。</w:t>
+            </w:r>
+            <w:r>
+              <w:br/>
+            </w:r>
+            <w:r>
+              <w:rPr>
+                <w:rFonts w:ascii="Consolas" w:hAnsi="Consolas" w:eastAsia="Consolas"/>
+                <w:color w:val="3C342D"/>
+                <w:sz w:val="18"/>
+              </w:rPr>
+              <w:t>我给你一组图片，请根据图片推荐产品、尺寸、材质和版式，并生成完整交付包。</w:t>
+            </w:r>
+          </w:p>
+        </w:tc>
+      </w:tr>
+    </w:tbl>
+    <w:p>
+      <w:pPr>
+        <w:spacing w:after="40"/>
+      </w:pPr>
+    </w:p>
+    <w:p>
+      <w:pPr>
+        <w:spacing w:after="120" w:line="283" w:lineRule="auto"/>
+      </w:pPr>
+      <w:r>
+        <w:rPr>
+          <w:rFonts w:ascii="Microsoft YaHei" w:hAnsi="Microsoft YaHei" w:eastAsia="Microsoft YaHei"/>
+          <w:color w:val="302920"/>
+          <w:sz w:val="21"/>
+        </w:rPr>
+        <w:t>如果需要手动运行，再执行：</w:t>
       </w:r>
     </w:p>
     <w:tbl>
@@ -4835,19 +6326,6 @@
       <w:pPr>
         <w:spacing w:after="40"/>
       </w:pPr>
-    </w:p>
-    <w:p>
-      <w:pPr>
-        <w:spacing w:after="120" w:line="283" w:lineRule="auto"/>
-      </w:pPr>
-      <w:r>
-        <w:rPr>
-          <w:rFonts w:ascii="Microsoft YaHei" w:hAnsi="Microsoft YaHei" w:eastAsia="Microsoft YaHei"/>
-          <w:color w:val="302920"/>
-          <w:sz w:val="21"/>
-        </w:rPr>
-        <w:t>然后按提示输入图片文件夹路径即可。</w:t>
-      </w:r>
     </w:p>
     <w:sectPr>
       <w:footerReference w:type="default" r:id="rId9"/>

</xml_diff>

<commit_message>
docs: add customer prompt templates
</commit_message>
<xml_diff>
--- a/Print Studio OpenDesign 客户使用手册.docx
+++ b/Print Studio OpenDesign 客户使用手册.docx
@@ -888,6 +888,83 @@
       </w:pPr>
       <w:r>
         <w:t>3. 客户常用说法模板</w:t>
+      </w:r>
+    </w:p>
+    <w:p>
+      <w:pPr>
+        <w:spacing w:after="120" w:line="283" w:lineRule="auto"/>
+      </w:pPr>
+      <w:r>
+        <w:rPr>
+          <w:rFonts w:ascii="Microsoft YaHei" w:hAnsi="Microsoft YaHei" w:eastAsia="Microsoft YaHei"/>
+          <w:color w:val="302920"/>
+          <w:sz w:val="21"/>
+        </w:rPr>
+        <w:t>完整模板库见：</w:t>
+      </w:r>
+    </w:p>
+    <w:tbl>
+      <w:tblPr>
+        <w:tblW w:type="auto" w:w="0"/>
+        <w:jc w:val="center"/>
+        <w:tblLayout w:type="fixed"/>
+        <w:tblLook w:firstColumn="1" w:firstRow="1" w:lastColumn="0" w:lastRow="0" w:noHBand="0" w:noVBand="1" w:val="04A0"/>
+        <w:tblBorders>
+          <w:top w:val="single" w:sz="4" w:space="0" w:color="E6DED5"/>
+          <w:left w:val="single" w:sz="4" w:space="0" w:color="E6DED5"/>
+          <w:bottom w:val="single" w:sz="4" w:space="0" w:color="E6DED5"/>
+          <w:right w:val="single" w:sz="4" w:space="0" w:color="E6DED5"/>
+          <w:insideH w:val="single" w:sz="4" w:space="0" w:color="E6DED5"/>
+          <w:insideV w:val="single" w:sz="4" w:space="0" w:color="E6DED5"/>
+        </w:tblBorders>
+      </w:tblPr>
+      <w:tblGrid>
+        <w:gridCol w:w="9072"/>
+      </w:tblGrid>
+      <w:tr>
+        <w:tc>
+          <w:tcPr>
+            <w:tcW w:type="dxa" w:w="9936"/>
+            <w:shd w:fill="FBF7F2"/>
+            <w:tcMar>
+              <w:top w:w="120" w:type="dxa"/>
+              <w:start w:w="160" w:type="dxa"/>
+              <w:bottom w:w="120" w:type="dxa"/>
+              <w:end w:w="160" w:type="dxa"/>
+            </w:tcMar>
+          </w:tcPr>
+          <w:p>
+            <w:pPr>
+              <w:spacing w:after="0"/>
+            </w:pPr>
+            <w:r>
+              <w:rPr>
+                <w:rFonts w:ascii="Consolas" w:hAnsi="Consolas" w:eastAsia="Consolas"/>
+                <w:color w:val="3C342D"/>
+                <w:sz w:val="18"/>
+              </w:rPr>
+              <w:t>user-workflow/prompt-templates.zh-CN.md</w:t>
+            </w:r>
+          </w:p>
+        </w:tc>
+      </w:tr>
+    </w:tbl>
+    <w:p>
+      <w:pPr>
+        <w:spacing w:after="40"/>
+      </w:pPr>
+    </w:p>
+    <w:p>
+      <w:pPr>
+        <w:spacing w:after="120" w:line="283" w:lineRule="auto"/>
+      </w:pPr>
+      <w:r>
+        <w:rPr>
+          <w:rFonts w:ascii="Microsoft YaHei" w:hAnsi="Microsoft YaHei" w:eastAsia="Microsoft YaHei"/>
+          <w:color w:val="302920"/>
+          <w:sz w:val="21"/>
+        </w:rPr>
+        <w:t>下面是最常用的几种：</w:t>
       </w:r>
     </w:p>
     <w:p>

</xml_diff>

<commit_message>
docs: add generalized guided skill flow
</commit_message>
<xml_diff>
--- a/Print Studio OpenDesign 客户使用手册.docx
+++ b/Print Studio OpenDesign 客户使用手册.docx
@@ -887,7 +887,235 @@
         <w:pStyle w:val="Heading1"/>
       </w:pPr>
       <w:r>
-        <w:t>3. 客户常用说法模板</w:t>
+        <w:t>3. Codex 会怎么一步步引导你</w:t>
+      </w:r>
+    </w:p>
+    <w:p>
+      <w:pPr>
+        <w:spacing w:after="120" w:line="283" w:lineRule="auto"/>
+      </w:pPr>
+      <w:r>
+        <w:rPr>
+          <w:rFonts w:ascii="Microsoft YaHei" w:hAnsi="Microsoft YaHei" w:eastAsia="Microsoft YaHei"/>
+          <w:color w:val="302920"/>
+          <w:sz w:val="21"/>
+        </w:rPr>
+        <w:t>这个 Skill 是泛化的，不只适用于月历卡。无论你要做贺卡、明信片、书签、吊牌、挂历、包装插卡，Codex 都会按同一套流程带你走。</w:t>
+      </w:r>
+    </w:p>
+    <w:p>
+      <w:pPr>
+        <w:spacing w:after="120" w:line="283" w:lineRule="auto"/>
+      </w:pPr>
+      <w:r>
+        <w:rPr>
+          <w:rFonts w:ascii="Microsoft YaHei" w:hAnsi="Microsoft YaHei" w:eastAsia="Microsoft YaHei"/>
+          <w:color w:val="302920"/>
+          <w:sz w:val="21"/>
+        </w:rPr>
+        <w:t>它不会一开始让你填复杂表格，而是一次只问一个小问题：</w:t>
+      </w:r>
+    </w:p>
+    <w:tbl>
+      <w:tblPr>
+        <w:tblW w:type="auto" w:w="0"/>
+        <w:jc w:val="center"/>
+        <w:tblLayout w:type="fixed"/>
+        <w:tblLook w:firstColumn="1" w:firstRow="1" w:lastColumn="0" w:lastRow="0" w:noHBand="0" w:noVBand="1" w:val="04A0"/>
+        <w:tblBorders>
+          <w:top w:val="single" w:sz="4" w:space="0" w:color="E6DED5"/>
+          <w:left w:val="single" w:sz="4" w:space="0" w:color="E6DED5"/>
+          <w:bottom w:val="single" w:sz="4" w:space="0" w:color="E6DED5"/>
+          <w:right w:val="single" w:sz="4" w:space="0" w:color="E6DED5"/>
+          <w:insideH w:val="single" w:sz="4" w:space="0" w:color="E6DED5"/>
+          <w:insideV w:val="single" w:sz="4" w:space="0" w:color="E6DED5"/>
+        </w:tblBorders>
+      </w:tblPr>
+      <w:tblGrid>
+        <w:gridCol w:w="9072"/>
+      </w:tblGrid>
+      <w:tr>
+        <w:tc>
+          <w:tcPr>
+            <w:tcW w:type="dxa" w:w="9936"/>
+            <w:shd w:fill="FBF7F2"/>
+            <w:tcMar>
+              <w:top w:w="120" w:type="dxa"/>
+              <w:start w:w="160" w:type="dxa"/>
+              <w:bottom w:w="120" w:type="dxa"/>
+              <w:end w:w="160" w:type="dxa"/>
+            </w:tcMar>
+          </w:tcPr>
+          <w:p>
+            <w:pPr>
+              <w:spacing w:after="0"/>
+            </w:pPr>
+            <w:r>
+              <w:rPr>
+                <w:rFonts w:ascii="Consolas" w:hAnsi="Consolas" w:eastAsia="Consolas"/>
+                <w:color w:val="3C342D"/>
+                <w:sz w:val="18"/>
+              </w:rPr>
+              <w:t>第 1 步：请发图片，或告诉我图片文件夹在哪里。</w:t>
+            </w:r>
+            <w:r>
+              <w:br/>
+            </w:r>
+            <w:r>
+              <w:rPr>
+                <w:rFonts w:ascii="Consolas" w:hAnsi="Consolas" w:eastAsia="Consolas"/>
+                <w:color w:val="3C342D"/>
+                <w:sz w:val="18"/>
+              </w:rPr>
+              <w:t>第 2 步：我先分析图片适合做什么产品。</w:t>
+            </w:r>
+            <w:r>
+              <w:br/>
+            </w:r>
+            <w:r>
+              <w:rPr>
+                <w:rFonts w:ascii="Consolas" w:hAnsi="Consolas" w:eastAsia="Consolas"/>
+                <w:color w:val="3C342D"/>
+                <w:sz w:val="18"/>
+              </w:rPr>
+              <w:t>第 3 步：我给你一个推荐方案，再给 2-3 个备选方案。</w:t>
+            </w:r>
+            <w:r>
+              <w:br/>
+            </w:r>
+            <w:r>
+              <w:rPr>
+                <w:rFonts w:ascii="Consolas" w:hAnsi="Consolas" w:eastAsia="Consolas"/>
+                <w:color w:val="3C342D"/>
+                <w:sz w:val="18"/>
+              </w:rPr>
+              <w:t>第 4 步：你选产品、尺寸、材质、张数和版式。</w:t>
+            </w:r>
+            <w:r>
+              <w:br/>
+            </w:r>
+            <w:r>
+              <w:rPr>
+                <w:rFonts w:ascii="Consolas" w:hAnsi="Consolas" w:eastAsia="Consolas"/>
+                <w:color w:val="3C342D"/>
+                <w:sz w:val="18"/>
+              </w:rPr>
+              <w:t>第 5 步：我先生成材质预览和 A/B/C 版式候选。</w:t>
+            </w:r>
+            <w:r>
+              <w:br/>
+            </w:r>
+            <w:r>
+              <w:rPr>
+                <w:rFonts w:ascii="Consolas" w:hAnsi="Consolas" w:eastAsia="Consolas"/>
+                <w:color w:val="3C342D"/>
+                <w:sz w:val="18"/>
+              </w:rPr>
+              <w:t>第 6 步：你选中一版，我锁版。</w:t>
+            </w:r>
+            <w:r>
+              <w:br/>
+            </w:r>
+            <w:r>
+              <w:rPr>
+                <w:rFonts w:ascii="Consolas" w:hAnsi="Consolas" w:eastAsia="Consolas"/>
+                <w:color w:val="3C342D"/>
+                <w:sz w:val="18"/>
+              </w:rPr>
+              <w:t>第 7 步：我批量输出预览图、印刷文件、白底图、氛围图、系列图、4K 下载图和交付包。</w:t>
+            </w:r>
+          </w:p>
+        </w:tc>
+      </w:tr>
+    </w:tbl>
+    <w:p>
+      <w:pPr>
+        <w:spacing w:after="40"/>
+      </w:pPr>
+    </w:p>
+    <w:p>
+      <w:pPr>
+        <w:spacing w:after="120" w:line="283" w:lineRule="auto"/>
+      </w:pPr>
+      <w:r>
+        <w:rPr>
+          <w:rFonts w:ascii="Microsoft YaHei" w:hAnsi="Microsoft YaHei" w:eastAsia="Microsoft YaHei"/>
+          <w:color w:val="302920"/>
+          <w:sz w:val="21"/>
+        </w:rPr>
+        <w:t>如果你不确定怎么选，可以直接说：</w:t>
+      </w:r>
+    </w:p>
+    <w:tbl>
+      <w:tblPr>
+        <w:tblW w:type="auto" w:w="0"/>
+        <w:jc w:val="center"/>
+        <w:tblLayout w:type="fixed"/>
+        <w:tblLook w:firstColumn="1" w:firstRow="1" w:lastColumn="0" w:lastRow="0" w:noHBand="0" w:noVBand="1" w:val="04A0"/>
+        <w:tblBorders>
+          <w:top w:val="single" w:sz="4" w:space="0" w:color="E6DED5"/>
+          <w:left w:val="single" w:sz="4" w:space="0" w:color="E6DED5"/>
+          <w:bottom w:val="single" w:sz="4" w:space="0" w:color="E6DED5"/>
+          <w:right w:val="single" w:sz="4" w:space="0" w:color="E6DED5"/>
+          <w:insideH w:val="single" w:sz="4" w:space="0" w:color="E6DED5"/>
+          <w:insideV w:val="single" w:sz="4" w:space="0" w:color="E6DED5"/>
+        </w:tblBorders>
+      </w:tblPr>
+      <w:tblGrid>
+        <w:gridCol w:w="9072"/>
+      </w:tblGrid>
+      <w:tr>
+        <w:tc>
+          <w:tcPr>
+            <w:tcW w:type="dxa" w:w="9936"/>
+            <w:shd w:fill="FBF7F2"/>
+            <w:tcMar>
+              <w:top w:w="120" w:type="dxa"/>
+              <w:start w:w="160" w:type="dxa"/>
+              <w:bottom w:w="120" w:type="dxa"/>
+              <w:end w:w="160" w:type="dxa"/>
+            </w:tcMar>
+          </w:tcPr>
+          <w:p>
+            <w:pPr>
+              <w:spacing w:after="0"/>
+            </w:pPr>
+            <w:r>
+              <w:rPr>
+                <w:rFonts w:ascii="Consolas" w:hAnsi="Consolas" w:eastAsia="Consolas"/>
+                <w:color w:val="3C342D"/>
+                <w:sz w:val="18"/>
+              </w:rPr>
+              <w:t>你先按推荐方案继续，并告诉我为什么这样选。</w:t>
+            </w:r>
+          </w:p>
+        </w:tc>
+      </w:tr>
+    </w:tbl>
+    <w:p>
+      <w:pPr>
+        <w:spacing w:after="40"/>
+      </w:pPr>
+    </w:p>
+    <w:p>
+      <w:pPr>
+        <w:spacing w:after="120" w:line="283" w:lineRule="auto"/>
+      </w:pPr>
+      <w:r>
+        <w:rPr>
+          <w:rFonts w:ascii="Microsoft YaHei" w:hAnsi="Microsoft YaHei" w:eastAsia="Microsoft YaHei"/>
+          <w:color w:val="302920"/>
+          <w:sz w:val="21"/>
+        </w:rPr>
+        <w:t>Codex 会默认帮你做判断，但不会偷偷批量定稿。正式批量输出前，会先让你确认版式候选。</w:t>
+      </w:r>
+    </w:p>
+    <w:p>
+      <w:pPr>
+        <w:pStyle w:val="Heading1"/>
+      </w:pPr>
+      <w:r>
+        <w:t>4. 客户常用说法模板</w:t>
       </w:r>
     </w:p>
     <w:p>
@@ -972,7 +1200,7 @@
         <w:pStyle w:val="Heading2"/>
       </w:pPr>
       <w:r>
-        <w:t>3.1 不知道做什么，让 Codex 推荐</w:t>
+        <w:t>4.1 不知道做什么，让 Codex 推荐</w:t>
       </w:r>
     </w:p>
     <w:tbl>
@@ -1053,7 +1281,7 @@
         <w:pStyle w:val="Heading2"/>
       </w:pPr>
       <w:r>
-        <w:t>3.2 做 12 个月月历卡</w:t>
+        <w:t>4.2 做 12 个月月历卡</w:t>
       </w:r>
     </w:p>
     <w:tbl>
@@ -1134,7 +1362,7 @@
         <w:pStyle w:val="Heading2"/>
       </w:pPr>
       <w:r>
-        <w:t>3.3 做贺卡</w:t>
+        <w:t>4.3 做贺卡</w:t>
       </w:r>
     </w:p>
     <w:tbl>
@@ -1215,7 +1443,7 @@
         <w:pStyle w:val="Heading2"/>
       </w:pPr>
       <w:r>
-        <w:t>3.4 做明信片 / 书签 / 吊牌</w:t>
+        <w:t>4.4 做明信片 / 书签 / 吊牌</w:t>
       </w:r>
     </w:p>
     <w:tbl>
@@ -1296,7 +1524,7 @@
         <w:pStyle w:val="Heading2"/>
       </w:pPr>
       <w:r>
-        <w:t>3.5 直接完整跑一遍</w:t>
+        <w:t>4.5 直接完整跑一遍</w:t>
       </w:r>
     </w:p>
     <w:tbl>
@@ -1421,7 +1649,7 @@
         <w:pStyle w:val="Heading1"/>
       </w:pPr>
       <w:r>
-        <w:t>4. 如果 Codex 需要你确认，它会问什么</w:t>
+        <w:t>5. 如果 Codex 需要你确认，它会问什么</w:t>
       </w:r>
     </w:p>
     <w:p>
@@ -1847,7 +2075,7 @@
         <w:pStyle w:val="Heading1"/>
       </w:pPr>
       <w:r>
-        <w:t>5. 使用前准备</w:t>
+        <w:t>6. 使用前准备</w:t>
       </w:r>
     </w:p>
     <w:p>
@@ -1855,7 +2083,7 @@
         <w:pStyle w:val="Heading2"/>
       </w:pPr>
       <w:r>
-        <w:t>5.1 准备图片文件夹</w:t>
+        <w:t>6.1 准备图片文件夹</w:t>
       </w:r>
     </w:p>
     <w:p>
@@ -2054,7 +2282,7 @@
         <w:pStyle w:val="Heading2"/>
       </w:pPr>
       <w:r>
-        <w:t>5.2 如果需要手动运行，再打开运行目录</w:t>
+        <w:t>6.2 如果需要手动运行，再打开运行目录</w:t>
       </w:r>
     </w:p>
     <w:p>
@@ -2190,7 +2418,7 @@
         <w:pStyle w:val="Heading1"/>
       </w:pPr>
       <w:r>
-        <w:t>6. 如果需要手动运行：一键引导流程</w:t>
+        <w:t>7. 如果需要手动运行：一键引导流程</w:t>
       </w:r>
     </w:p>
     <w:p>
@@ -2511,7 +2739,7 @@
         <w:pStyle w:val="Heading2"/>
       </w:pPr>
       <w:r>
-        <w:t>6.1 如果已经知道参数，可以一条命令跑完</w:t>
+        <w:t>7.1 如果已经知道参数，可以一条命令跑完</w:t>
       </w:r>
     </w:p>
     <w:p>
@@ -3673,7 +3901,7 @@
         <w:pStyle w:val="Heading1"/>
       </w:pPr>
       <w:r>
-        <w:t>7. 每一步会得到什么</w:t>
+        <w:t>8. 每一步会得到什么</w:t>
       </w:r>
     </w:p>
     <w:p>
@@ -4718,7 +4946,7 @@
         <w:pStyle w:val="Heading1"/>
       </w:pPr>
       <w:r>
-        <w:t>8. 输出文件怎么理解</w:t>
+        <w:t>9. 输出文件怎么理解</w:t>
       </w:r>
     </w:p>
     <w:p>
@@ -4922,7 +5150,7 @@
         <w:pStyle w:val="Heading2"/>
       </w:pPr>
       <w:r>
-        <w:t>8.1 `screen/`</w:t>
+        <w:t>9.1 `screen/`</w:t>
       </w:r>
     </w:p>
     <w:p>
@@ -4943,7 +5171,7 @@
         <w:pStyle w:val="Heading2"/>
       </w:pPr>
       <w:r>
-        <w:t>8.2 `print/`</w:t>
+        <w:t>9.2 `print/`</w:t>
       </w:r>
     </w:p>
     <w:p>
@@ -4977,7 +5205,7 @@
         <w:pStyle w:val="Heading2"/>
       </w:pPr>
       <w:r>
-        <w:t>8.3 `commerce/`</w:t>
+        <w:t>9.3 `commerce/`</w:t>
       </w:r>
     </w:p>
     <w:p>
@@ -5053,7 +5281,7 @@
         <w:pStyle w:val="Heading2"/>
       </w:pPr>
       <w:r>
-        <w:t>8.4 `download_4k/`</w:t>
+        <w:t>9.4 `download_4k/`</w:t>
       </w:r>
     </w:p>
     <w:p>
@@ -5074,7 +5302,7 @@
         <w:pStyle w:val="Heading2"/>
       </w:pPr>
       <w:r>
-        <w:t>8.5 `reports/`</w:t>
+        <w:t>9.5 `reports/`</w:t>
       </w:r>
     </w:p>
     <w:p>
@@ -5151,7 +5379,7 @@
         <w:pStyle w:val="Heading1"/>
       </w:pPr>
       <w:r>
-        <w:t>9. 如何判断能不能交付</w:t>
+        <w:t>10. 如何判断能不能交付</w:t>
       </w:r>
     </w:p>
     <w:p>
@@ -5633,7 +5861,7 @@
         <w:pStyle w:val="Heading1"/>
       </w:pPr>
       <w:r>
-        <w:t>10. 推荐给终端客户看的文件</w:t>
+        <w:t>11. 推荐给终端客户看的文件</w:t>
       </w:r>
     </w:p>
     <w:p>
@@ -5921,7 +6149,7 @@
         <w:pStyle w:val="Heading1"/>
       </w:pPr>
       <w:r>
-        <w:t>11. 常见问题</w:t>
+        <w:t>12. 常见问题</w:t>
       </w:r>
     </w:p>
     <w:p>
@@ -6181,7 +6409,7 @@
         <w:pStyle w:val="Heading1"/>
       </w:pPr>
       <w:r>
-        <w:t>12. 最简单的交付演示话术</w:t>
+        <w:t>13. 最简单的交付演示话术</w:t>
       </w:r>
     </w:p>
     <w:p>
@@ -6262,7 +6490,7 @@
         <w:pStyle w:val="Heading1"/>
       </w:pPr>
       <w:r>
-        <w:t>13. 一句话开始使用</w:t>
+        <w:t>14. 一句话开始使用</w:t>
       </w:r>
     </w:p>
     <w:p>

</xml_diff>